<commit_message>
[THESIS] fill cover placeholders: name, MSSV, title VN/EN, advisor
</commit_message>
<xml_diff>
--- a/thesis/Templates/MAU bia ngoai 2.docx
+++ b/thesis/Templates/MAU bia ngoai 2.docx
@@ -396,7 +396,7 @@
           <w:sz w:val="38"/>
           <w:szCs w:val="48"/>
         </w:rPr>
-        <w:t>NGUYỄN VĂN A</w:t>
+        <w:t>CAO TRỌNG PHƯỚC</w:t>
       </w:r>
     </w:p>
     <w:p>
@@ -548,7 +548,7 @@
           <w:sz w:val="36"/>
           <w:szCs w:val="44"/>
         </w:rPr>
-        <w:t>QUY TRÌNH THIẾT KẾ VI MẠCH TÍCH HỢP</w:t>
+        <w:t>HỆ THỐNG ĐỊNH VỊ TRONG NHÀ THEO PHÒNG</w:t>
       </w:r>
     </w:p>
     <w:p>
@@ -569,7 +569,7 @@
           <w:sz w:val="36"/>
           <w:szCs w:val="44"/>
         </w:rPr>
-        <w:t>DÙNG KỸ THUẬT DESIGN FOR TEST</w:t>
+        <w:t>DỰA TRÊN BLE MESH VÀ ESP32</w:t>
       </w:r>
     </w:p>
     <w:p>

</xml_diff>